<commit_message>
final edit EH&PT adssignment
</commit_message>
<xml_diff>
--- a/Sem-3/EH & PT (Ethical Hacking & Penetration Testing)/ClassRoom/Assignment/E02_Vishal_EH&PT_Assignment.docx
+++ b/Sem-3/EH & PT (Ethical Hacking & Penetration Testing)/ClassRoom/Assignment/E02_Vishal_EH&PT_Assignment.docx
@@ -531,10 +531,10 @@
         <w:tblLook w:val="04A0" w:firstRow="1" w:lastRow="0" w:firstColumn="1" w:lastColumn="0" w:noHBand="0" w:noVBand="1"/>
       </w:tblPr>
       <w:tblGrid>
-        <w:gridCol w:w="1400"/>
-        <w:gridCol w:w="2659"/>
-        <w:gridCol w:w="2940"/>
-        <w:gridCol w:w="3359"/>
+        <w:gridCol w:w="1399"/>
+        <w:gridCol w:w="2657"/>
+        <w:gridCol w:w="2937"/>
+        <w:gridCol w:w="3355"/>
       </w:tblGrid>
       <w:tr>
         <w:trPr>
@@ -903,9 +903,9 @@
       </w:tblPr>
       <w:tblGrid>
         <w:gridCol w:w="1914"/>
-        <w:gridCol w:w="2196"/>
-        <w:gridCol w:w="3628"/>
-        <w:gridCol w:w="2749"/>
+        <w:gridCol w:w="2168"/>
+        <w:gridCol w:w="3559"/>
+        <w:gridCol w:w="2707"/>
       </w:tblGrid>
       <w:tr>
         <w:trPr>
@@ -1289,8 +1289,8 @@
       </w:tblPr>
       <w:tblGrid>
         <w:gridCol w:w="2187"/>
-        <w:gridCol w:w="4131"/>
-        <w:gridCol w:w="4040"/>
+        <w:gridCol w:w="4126"/>
+        <w:gridCol w:w="4035"/>
       </w:tblGrid>
       <w:tr>
         <w:trPr>
@@ -1768,8 +1768,8 @@
       </w:tblPr>
       <w:tblGrid>
         <w:gridCol w:w="1276"/>
-        <w:gridCol w:w="3827"/>
-        <w:gridCol w:w="5255"/>
+        <w:gridCol w:w="3823"/>
+        <w:gridCol w:w="5249"/>
       </w:tblGrid>
       <w:tr>
         <w:trPr>
@@ -2269,9 +2269,9 @@
         <w:tblLook w:val="04A0" w:firstRow="1" w:lastRow="0" w:firstColumn="1" w:lastColumn="0" w:noHBand="0" w:noVBand="1"/>
       </w:tblPr>
       <w:tblGrid>
-        <w:gridCol w:w="2127"/>
-        <w:gridCol w:w="3260"/>
-        <w:gridCol w:w="4971"/>
+        <w:gridCol w:w="2125"/>
+        <w:gridCol w:w="3258"/>
+        <w:gridCol w:w="4965"/>
       </w:tblGrid>
       <w:tr>
         <w:trPr>
@@ -2635,9 +2635,9 @@
       </w:tblPr>
       <w:tblGrid>
         <w:gridCol w:w="1276"/>
-        <w:gridCol w:w="2268"/>
-        <w:gridCol w:w="4226"/>
-        <w:gridCol w:w="2588"/>
+        <w:gridCol w:w="2267"/>
+        <w:gridCol w:w="4219"/>
+        <w:gridCol w:w="2586"/>
       </w:tblGrid>
       <w:tr>
         <w:trPr>
@@ -3465,9 +3465,9 @@
         <w:tblLook w:val="04A0" w:firstRow="1" w:lastRow="0" w:firstColumn="1" w:lastColumn="0" w:noHBand="0" w:noVBand="1"/>
       </w:tblPr>
       <w:tblGrid>
-        <w:gridCol w:w="3261"/>
-        <w:gridCol w:w="5670"/>
-        <w:gridCol w:w="1643"/>
+        <w:gridCol w:w="3184"/>
+        <w:gridCol w:w="5528"/>
+        <w:gridCol w:w="1636"/>
       </w:tblGrid>
       <w:tr>
         <w:trPr>
@@ -4022,7 +4022,7 @@
           <w:noProof/>
         </w:rPr>
         <w:drawing>
-          <wp:inline distT="0" distB="0" distL="0" distR="0" wp14:anchorId="2BF66137" wp14:editId="508A11C3">
+          <wp:inline distT="0" distB="0" distL="0" distR="0" wp14:anchorId="2BF66137" wp14:editId="54488360">
             <wp:extent cx="6645910" cy="3733800"/>
             <wp:effectExtent l="0" t="0" r="2540" b="0"/>
             <wp:docPr id="882182397" name="Picture 4"/>
@@ -4204,9 +4204,9 @@
         <w:tblLook w:val="04A0" w:firstRow="1" w:lastRow="0" w:firstColumn="1" w:lastColumn="0" w:noHBand="0" w:noVBand="1"/>
       </w:tblPr>
       <w:tblGrid>
-        <w:gridCol w:w="2552"/>
-        <w:gridCol w:w="3544"/>
-        <w:gridCol w:w="4262"/>
+        <w:gridCol w:w="2550"/>
+        <w:gridCol w:w="3541"/>
+        <w:gridCol w:w="4257"/>
       </w:tblGrid>
       <w:tr>
         <w:trPr>
@@ -4762,11 +4762,11 @@
         <w:tblLook w:val="0420" w:firstRow="1" w:lastRow="0" w:firstColumn="0" w:lastColumn="0" w:noHBand="0" w:noVBand="1"/>
       </w:tblPr>
       <w:tblGrid>
-        <w:gridCol w:w="1196"/>
-        <w:gridCol w:w="821"/>
-        <w:gridCol w:w="1288"/>
-        <w:gridCol w:w="3157"/>
-        <w:gridCol w:w="4112"/>
+        <w:gridCol w:w="1195"/>
+        <w:gridCol w:w="819"/>
+        <w:gridCol w:w="1275"/>
+        <w:gridCol w:w="3085"/>
+        <w:gridCol w:w="3974"/>
       </w:tblGrid>
       <w:tr>
         <w:trPr>
@@ -6260,9 +6260,9 @@
         <w:tblLook w:val="04A0" w:firstRow="1" w:lastRow="0" w:firstColumn="1" w:lastColumn="0" w:noHBand="0" w:noVBand="1"/>
       </w:tblPr>
       <w:tblGrid>
-        <w:gridCol w:w="2268"/>
-        <w:gridCol w:w="3969"/>
-        <w:gridCol w:w="4121"/>
+        <w:gridCol w:w="2267"/>
+        <w:gridCol w:w="3965"/>
+        <w:gridCol w:w="4116"/>
       </w:tblGrid>
       <w:tr>
         <w:trPr>
@@ -7055,9 +7055,9 @@
         <w:tblLook w:val="04A0" w:firstRow="1" w:lastRow="0" w:firstColumn="1" w:lastColumn="0" w:noHBand="0" w:noVBand="1"/>
       </w:tblPr>
       <w:tblGrid>
-        <w:gridCol w:w="2694"/>
-        <w:gridCol w:w="3685"/>
-        <w:gridCol w:w="3979"/>
+        <w:gridCol w:w="2692"/>
+        <w:gridCol w:w="3681"/>
+        <w:gridCol w:w="3975"/>
       </w:tblGrid>
       <w:tr>
         <w:trPr>
@@ -7595,8 +7595,8 @@
       </w:tblPr>
       <w:tblGrid>
         <w:gridCol w:w="2410"/>
-        <w:gridCol w:w="3686"/>
-        <w:gridCol w:w="4268"/>
+        <w:gridCol w:w="3679"/>
+        <w:gridCol w:w="4259"/>
       </w:tblGrid>
       <w:tr>
         <w:trPr>
@@ -8732,7 +8732,7 @@
       </w:tblPr>
       <w:tblGrid>
         <w:gridCol w:w="1560"/>
-        <w:gridCol w:w="8798"/>
+        <w:gridCol w:w="8788"/>
       </w:tblGrid>
       <w:tr>
         <w:trPr>
@@ -10112,8 +10112,8 @@
         <w:tblLook w:val="04A0" w:firstRow="1" w:lastRow="0" w:firstColumn="1" w:lastColumn="0" w:noHBand="0" w:noVBand="1"/>
       </w:tblPr>
       <w:tblGrid>
-        <w:gridCol w:w="5179"/>
-        <w:gridCol w:w="5179"/>
+        <w:gridCol w:w="5174"/>
+        <w:gridCol w:w="5174"/>
       </w:tblGrid>
       <w:tr>
         <w:trPr>
@@ -10566,9 +10566,9 @@
         <w:tblLook w:val="04A0" w:firstRow="1" w:lastRow="0" w:firstColumn="1" w:lastColumn="0" w:noHBand="0" w:noVBand="1"/>
       </w:tblPr>
       <w:tblGrid>
-        <w:gridCol w:w="2127"/>
-        <w:gridCol w:w="3969"/>
-        <w:gridCol w:w="4262"/>
+        <w:gridCol w:w="2126"/>
+        <w:gridCol w:w="3965"/>
+        <w:gridCol w:w="4257"/>
       </w:tblGrid>
       <w:tr>
         <w:trPr>
@@ -10866,17 +10866,110 @@
         <w:spacing w:after="400"/>
         <w:jc w:val="both"/>
         <w:rPr>
-          <w:sz w:val="28"/>
-          <w:szCs w:val="28"/>
-        </w:rPr>
-      </w:pPr>
-      <w:r>
-        <w:rPr>
           <w:b/>
           <w:sz w:val="30"/>
           <w:szCs w:val="28"/>
         </w:rPr>
+      </w:pPr>
+      <w:r>
+        <w:rPr>
+          <w:b/>
+          <w:sz w:val="30"/>
+          <w:szCs w:val="28"/>
+        </w:rPr>
         <w:t>Unit V – VAPT Reporting</w:t>
+      </w:r>
+    </w:p>
+    <w:p>
+      <w:pPr>
+        <w:spacing w:after="400"/>
+        <w:jc w:val="both"/>
+        <w:rPr>
+          <w:b/>
+          <w:sz w:val="30"/>
+          <w:szCs w:val="28"/>
+        </w:rPr>
+      </w:pPr>
+    </w:p>
+    <w:p>
+      <w:pPr>
+        <w:spacing w:after="400"/>
+        <w:jc w:val="both"/>
+        <w:rPr>
+          <w:sz w:val="26"/>
+          <w:szCs w:val="24"/>
+        </w:rPr>
+      </w:pPr>
+      <w:r>
+        <w:rPr>
+          <w:sz w:val="26"/>
+          <w:szCs w:val="24"/>
+        </w:rPr>
+        <w:t xml:space="preserve">Zip have </w:t>
+      </w:r>
+      <w:r>
+        <w:rPr>
+          <w:sz w:val="26"/>
+          <w:szCs w:val="24"/>
+        </w:rPr>
+        <w:t>VAPT Report</w:t>
+      </w:r>
+      <w:r>
+        <w:rPr>
+          <w:sz w:val="26"/>
+          <w:szCs w:val="24"/>
+        </w:rPr>
+        <w:t xml:space="preserve"> File </w:t>
+      </w:r>
+      <w:proofErr w:type="gramStart"/>
+      <w:r>
+        <w:rPr>
+          <w:sz w:val="26"/>
+          <w:szCs w:val="24"/>
+        </w:rPr>
+        <w:t>Named :</w:t>
+      </w:r>
+      <w:proofErr w:type="gramEnd"/>
+      <w:r>
+        <w:rPr>
+          <w:sz w:val="26"/>
+          <w:szCs w:val="24"/>
+        </w:rPr>
+        <w:t xml:space="preserve">- </w:t>
+      </w:r>
+      <w:r>
+        <w:rPr>
+          <w:b/>
+          <w:bCs/>
+          <w:sz w:val="26"/>
+          <w:szCs w:val="24"/>
+        </w:rPr>
+        <w:t>“</w:t>
+      </w:r>
+      <w:r>
+        <w:rPr>
+          <w:b/>
+          <w:bCs/>
+          <w:sz w:val="26"/>
+          <w:szCs w:val="24"/>
+        </w:rPr>
+        <w:t>E02_Vishal_Q20_VAPT_Report.docx</w:t>
+      </w:r>
+      <w:r>
+        <w:rPr>
+          <w:b/>
+          <w:bCs/>
+          <w:sz w:val="26"/>
+          <w:szCs w:val="24"/>
+        </w:rPr>
+        <w:t>”</w:t>
+      </w:r>
+      <w:r>
+        <w:rPr>
+          <w:sz w:val="26"/>
+          <w:szCs w:val="24"/>
+        </w:rPr>
+        <w:t xml:space="preserve"> </w:t>
       </w:r>
     </w:p>
     <w:p>

</xml_diff>